<commit_message>
docs: convertisseur md→docx robuste (gras multi-lignes, citations, code, boucle infinie)
- _md_to_docx.py : regroupe les paragraphes (gras sur 2 lignes), gras dans les
  citations, absorbe les continuations de puces, rend les blocs ``` en monospace,
  et corrige une boucle infinie sur les lignes '#hashtag' (doc LinkedIn).
- Régénère les 3 DOCX + PDF propres (vérifiés visuellement).

Co-Authored-By: Claude Opus 4.8 <noreply@anthropic.com>
</commit_message>
<xml_diff>
--- a/docs/GETSHIFT_DIFFERENCIATION_MONETISATION.docx
+++ b/docs/GETSHIFT_DIFFERENCIATION_MONETISATION.docx
@@ -19,31 +19,7 @@
           <w:i/>
           <w:color w:val="555555"/>
         </w:rPr>
-        <w:t>Doc de travail, 2026-06-03. Objectif : (1) en quoi GetShift se démarque,</w:t>
-      </w:r>
-    </w:p>
-    <w:p>
-      <w:pPr>
-        <w:ind w:left="360"/>
-      </w:pPr>
-      <w:r>
-        <w:rPr>
-          <w:i/>
-          <w:color w:val="555555"/>
-        </w:rPr>
-        <w:t>(2) ce qui pousse à payer, (3) comment en tirer de l'argent — avec une lecture</w:t>
-      </w:r>
-    </w:p>
-    <w:p>
-      <w:pPr>
-        <w:ind w:left="360"/>
-      </w:pPr>
-      <w:r>
-        <w:rPr>
-          <w:i/>
-          <w:color w:val="555555"/>
-        </w:rPr>
-        <w:t>honnête du délai.</w:t>
+        <w:t>Doc de travail, 2026-06-03. Objectif : (1) en quoi GetShift se démarque, (2) ce qui pousse à payer, (3) comment en tirer de l'argent — avec une lecture honnête du délai.</w:t>
       </w:r>
     </w:p>
     <w:p>
@@ -64,10 +40,8 @@
     </w:p>
     <w:p>
       <w:r>
-        <w:t>La plupart des apps de productivité (Todoist, TickTick, Notion, Things…) sont des</w:t>
+        <w:t xml:space="preserve">La plupart des apps de productivité (Todoist, TickTick, Notion, Things…) sont des </w:t>
       </w:r>
-    </w:p>
-    <w:p>
       <w:r>
         <w:rPr>
           <w:b/>
@@ -132,17 +106,7 @@
         <w:t>navigue dans l'app</w:t>
       </w:r>
       <w:r>
-        <w:t>,</w:t>
-      </w:r>
-    </w:p>
-    <w:p>
-      <w:r>
-        <w:t xml:space="preserve">  planifie ta journée, décompose un objectif. Tu lui parles en langage normal,</w:t>
-      </w:r>
-    </w:p>
-    <w:p>
-      <w:r>
-        <w:t xml:space="preserve">  il fait l'action.</w:t>
+        <w:t>, planifie ta journée, décompose un objectif. Tu lui parles en langage normal, il fait l'action.</w:t>
       </w:r>
     </w:p>
     <w:p>
@@ -150,12 +114,16 @@
         <w:pStyle w:val="ListBullet"/>
       </w:pPr>
       <w:r>
-        <w:t>Chez les autres, l'IA te répond un texte. Chez GetShift, elle **bouge les pièces</w:t>
+        <w:t xml:space="preserve">Chez les autres, l'IA te répond un texte. Chez GetShift, elle </w:t>
       </w:r>
-    </w:p>
-    <w:p>
       <w:r>
-        <w:t xml:space="preserve">  à ta place**. C'est la différence entre un conseiller et un assistant.</w:t>
+        <w:rPr>
+          <w:b/>
+        </w:rPr>
+        <w:t>bouge les pièces à ta place</w:t>
+      </w:r>
+      <w:r>
+        <w:t>. C'est la différence entre un conseiller et un assistant.</w:t>
       </w:r>
     </w:p>
     <w:p>
@@ -186,12 +154,7 @@
         <w:t>tes pics d'énergie</w:t>
       </w:r>
       <w:r>
-        <w:t xml:space="preserve"> et tes</w:t>
-      </w:r>
-    </w:p>
-    <w:p>
-      <w:r>
-        <w:t xml:space="preserve">  priorités, pas juste sur un créneau horaire vide.</w:t>
+        <w:t xml:space="preserve"> et tes priorités, pas juste sur un créneau horaire vide.</w:t>
       </w:r>
     </w:p>
     <w:p>
@@ -205,12 +168,7 @@
         <w:t>Goal Reverse</w:t>
       </w:r>
       <w:r>
-        <w:t xml:space="preserve"> prend un grand objectif (« lancer mon side-project », « réviser</w:t>
-      </w:r>
-    </w:p>
-    <w:p>
-      <w:r>
-        <w:t xml:space="preserve">  le concours ») et le </w:t>
+        <w:t xml:space="preserve"> prend un grand objectif (« lancer mon side-project », « réviser le concours ») et le </w:t>
       </w:r>
       <w:r>
         <w:rPr>
@@ -227,12 +185,7 @@
         <w:pStyle w:val="ListBullet"/>
       </w:pPr>
       <w:r>
-        <w:t>Personne ne fait *« dis-moi ton but → voici le plan jour par jour → c'est déjà</w:t>
-      </w:r>
-    </w:p>
-    <w:p>
-      <w:r>
-        <w:t xml:space="preserve">  dans ton agenda »* aussi simplement.</w:t>
+        <w:t>Personne ne fait *« dis-moi ton but → voici le plan jour par jour → c'est déjà dans ton agenda »* aussi simplement.</w:t>
       </w:r>
     </w:p>
     <w:p>
@@ -257,12 +210,7 @@
         <w:t>coach</w:t>
       </w:r>
       <w:r>
-        <w:t xml:space="preserve"> (3 personnalités) t'envoie chaque jour un mot : encouragement,</w:t>
-      </w:r>
-    </w:p>
-    <w:p>
-      <w:r>
-        <w:t xml:space="preserve">  rappel, ou défi adapté à ton rythme. + niveaux, badges, streaks.</w:t>
+        <w:t xml:space="preserve"> (3 personnalités) t'envoie chaque jour un mot : encouragement, rappel, ou défi adapté à ton rythme. + niveaux, badges, streaks.</w:t>
       </w:r>
     </w:p>
     <w:p>
@@ -270,26 +218,25 @@
         <w:pStyle w:val="ListBullet"/>
       </w:pPr>
       <w:r>
-        <w:t>La productivité, le vrai problème ce n'est pas « lister », c'est **tenir dans la</w:t>
-      </w:r>
-    </w:p>
-    <w:p>
-      <w:r>
-        <w:t xml:space="preserve">  durée</w:t>
+        <w:t xml:space="preserve">La productivité, le vrai problème ce n'est pas « lister », c'est </w:t>
       </w:r>
       <w:r>
         <w:rPr>
           <w:b/>
         </w:rPr>
+        <w:t>tenir dans la durée</w:t>
+      </w:r>
+      <w:r>
         <w:t xml:space="preserve">. GetShift ajoute la couche </w:t>
       </w:r>
       <w:r>
-        <w:t>motivation/rétention** que les listes nues</w:t>
+        <w:rPr>
+          <w:b/>
+        </w:rPr>
+        <w:t>motivation/rétention</w:t>
       </w:r>
-    </w:p>
-    <w:p>
       <w:r>
-        <w:t xml:space="preserve">  n'ont pas.</w:t>
+        <w:t xml:space="preserve"> que les listes nues n'ont pas.</w:t>
       </w:r>
     </w:p>
     <w:p>
@@ -311,12 +258,7 @@
         <w:t>Intégrations réelles</w:t>
       </w:r>
       <w:r>
-        <w:t xml:space="preserve"> : Google Agenda (sync 2 sens temps réel), Gmail (extrait</w:t>
-      </w:r>
-    </w:p>
-    <w:p>
-      <w:r>
-        <w:t xml:space="preserve">  des tâches des mails), Drive, Notion. Plus tu connectes, plus c'est dur de partir.</w:t>
+        <w:t xml:space="preserve"> : Google Agenda (sync 2 sens temps réel), Gmail (extrait des tâches des mails), Drive, Notion. Plus tu connectes, plus c'est dur de partir.</w:t>
       </w:r>
     </w:p>
     <w:p>
@@ -330,17 +272,7 @@
         <w:t>6 langues</w:t>
       </w:r>
       <w:r>
-        <w:t xml:space="preserve"> : FR, EN, ES, PT, DE, AR. Très rare pour une app indé → ça ouvre</w:t>
-      </w:r>
-    </w:p>
-    <w:p>
-      <w:r>
-        <w:t xml:space="preserve">  l'Afrique francophone, l'Amérique latine, le monde arabophone, là où la</w:t>
-      </w:r>
-    </w:p>
-    <w:p>
-      <w:r>
-        <w:t xml:space="preserve">  concurrence anglo-saxonne est faible.</w:t>
+        <w:t xml:space="preserve"> : FR, EN, ES, PT, DE, AR. Très rare pour une app indé → ça ouvre l'Afrique francophone, l'Amérique latine, le monde arabophone, là où la concurrence anglo-saxonne est faible.</w:t>
       </w:r>
     </w:p>
     <w:p>
@@ -354,12 +286,7 @@
         <w:t>GetShift School</w:t>
       </w:r>
       <w:r>
-        <w:t xml:space="preserve"> (B2B2C, au-dessus de Moodle) : une porte d'entrée</w:t>
-      </w:r>
-    </w:p>
-    <w:p>
-      <w:r>
-        <w:t xml:space="preserve">  institutionnelle que les apps grand public n'ont pas.</w:t>
+        <w:t xml:space="preserve"> (B2B2C, au-dessus de Moodle) : une porte d'entrée institutionnelle que les apps grand public n'ont pas.</w:t>
       </w:r>
     </w:p>
     <w:p>
@@ -379,31 +306,7 @@
           <w:i/>
           <w:color w:val="555555"/>
         </w:rPr>
-        <w:t>« GetShift, ce n'est pas une to-do list de plus. C'est l'assistant IA qui</w:t>
-      </w:r>
-    </w:p>
-    <w:p>
-      <w:pPr>
-        <w:ind w:left="360"/>
-      </w:pPr>
-      <w:r>
-        <w:rPr>
-          <w:i/>
-          <w:color w:val="555555"/>
-        </w:rPr>
-        <w:t>planifie ta journée, transforme tes objectifs en étapes, et te tient dans la</w:t>
-      </w:r>
-    </w:p>
-    <w:p>
-      <w:pPr>
-        <w:ind w:left="360"/>
-      </w:pPr>
-      <w:r>
-        <w:rPr>
-          <w:i/>
-          <w:color w:val="555555"/>
-        </w:rPr>
-        <w:t>durée — pendant que les autres te laissent une liste vide. »</w:t>
+        <w:t>« GetShift, ce n'est pas une to-do list de plus. C'est l'assistant IA qui planifie ta journée, transforme tes objectifs en étapes, et te tient dans la durée — pendant que les autres te laissent une liste vide. »</w:t>
       </w:r>
     </w:p>
     <w:p>
@@ -424,26 +327,25 @@
     </w:p>
     <w:p>
       <w:r>
-        <w:t>Règle d'or : **le gratuit doit être utile, le payant doit être irrésistible pour</w:t>
-      </w:r>
-    </w:p>
-    <w:p>
-      <w:r>
-        <w:t>ceux qui s'en servent vraiment.</w:t>
+        <w:t xml:space="preserve">Règle d'or : </w:t>
       </w:r>
       <w:r>
         <w:rPr>
           <w:b/>
         </w:rPr>
+        <w:t>le gratuit doit être utile, le payant doit être irrésistible pour ceux qui s'en servent vraiment.</w:t>
+      </w:r>
+      <w:r>
         <w:t xml:space="preserve"> Le levier de conversion = </w:t>
       </w:r>
       <w:r>
-        <w:t>l'IA et la</w:t>
+        <w:rPr>
+          <w:b/>
+        </w:rPr>
+        <w:t>l'IA et la planification</w:t>
       </w:r>
-    </w:p>
-    <w:p>
       <w:r>
-        <w:t>planification**, parce que c'est ce qui coûte (tokens) ET ce qui a le plus de valeur.</w:t>
+        <w:t>, parce que c'est ce qui coûte (tokens) ET ce qui a le plus de valeur.</w:t>
       </w:r>
     </w:p>
     <w:p>
@@ -796,10 +698,8 @@
         <w:t>quota IA</w:t>
       </w:r>
       <w:r>
-        <w:t xml:space="preserve"> ou la</w:t>
+        <w:t xml:space="preserve"> ou la </w:t>
       </w:r>
-    </w:p>
-    <w:p>
       <w:r>
         <w:rPr>
           <w:b/>
@@ -807,12 +707,7 @@
         <w:t>2ᵉ intégration</w:t>
       </w:r>
       <w:r>
-        <w:t xml:space="preserve"> au moment exact où il en tire de la valeur → il paie pour lever</w:t>
-      </w:r>
-    </w:p>
-    <w:p>
-      <w:r>
-        <w:t>la limite. On ne fait jamais payer pour *commencer*, on fait payer pour *aller plus loin*.</w:t>
+        <w:t xml:space="preserve"> au moment exact où il en tire de la valeur → il paie pour lever la limite. On ne fait jamais payer pour *commencer*, on fait payer pour *aller plus loin*.</w:t>
       </w:r>
     </w:p>
     <w:p>
@@ -876,12 +771,7 @@
         <w:t>Une app de productivité B2C neuve ne fait PAS d'argent demain.</w:t>
       </w:r>
       <w:r>
-        <w:t xml:space="preserve"> À 4,99 €/mois, il</w:t>
-      </w:r>
-    </w:p>
-    <w:p>
-      <w:r>
-        <w:t xml:space="preserve">faut des </w:t>
+        <w:t xml:space="preserve"> À 4,99 €/mois, il faut des </w:t>
       </w:r>
       <w:r>
         <w:rPr>
@@ -890,12 +780,7 @@
         <w:t>centaines d'abonnés</w:t>
       </w:r>
       <w:r>
-        <w:t xml:space="preserve"> pour que ça compte, et la conversion gratuit→payant</w:t>
-      </w:r>
-    </w:p>
-    <w:p>
-      <w:r>
-        <w:t xml:space="preserve">en SaaS tourne autour de </w:t>
+        <w:t xml:space="preserve"> pour que ça compte, et la conversion gratuit→payant en SaaS tourne autour de </w:t>
       </w:r>
       <w:r>
         <w:rPr>
@@ -904,12 +789,7 @@
         <w:t>2–5 %</w:t>
       </w:r>
       <w:r>
-        <w:t>. Donc 1 000 inscrits ≈ 20–50 payants ≈ 100–250 €/mois.</w:t>
-      </w:r>
-    </w:p>
-    <w:p>
-      <w:r>
-        <w:t xml:space="preserve">Ça se construit en </w:t>
+        <w:t xml:space="preserve">. Donc 1 000 inscrits ≈ 20–50 payants ≈ 100–250 €/mois. Ça se construit en </w:t>
       </w:r>
       <w:r>
         <w:rPr>
@@ -962,15 +842,8 @@
         </w:rPr>
         <w:t>Sèmè City</w:t>
       </w:r>
-    </w:p>
-    <w:p>
       <w:r>
-        <w:t xml:space="preserve">  est ton meilleur levier court terme : un accord à quelques centaines/milliers</w:t>
-      </w:r>
-    </w:p>
-    <w:p>
-      <w:r>
-        <w:t xml:space="preserve">  d'euros se signe en une réunion, pas en 1 000 inscriptions.</w:t>
+        <w:t xml:space="preserve"> est ton meilleur levier court terme : un accord à quelques centaines/milliers d'euros se signe en une réunion, pas en 1 000 inscriptions.</w:t>
       </w:r>
     </w:p>
     <w:p>
@@ -987,12 +860,7 @@
         <w:t>offre payante</w:t>
       </w:r>
       <w:r>
-        <w:t xml:space="preserve"> (licence par établissement /</w:t>
-      </w:r>
-    </w:p>
-    <w:p>
-      <w:r>
-        <w:t xml:space="preserve">  par étudiant). C'est là que l'argent rentre vite si tu pousses.</w:t>
+        <w:t xml:space="preserve"> (licence par établissement / par étudiant). C'est là que l'argent rentre vite si tu pousses.</w:t>
       </w:r>
     </w:p>
     <w:p>
@@ -1017,12 +885,7 @@
         <w:t>alimenter le haut du tunnel</w:t>
       </w:r>
       <w:r>
-        <w:t xml:space="preserve"> via LinkedIn</w:t>
-      </w:r>
-    </w:p>
-    <w:p>
-      <w:r>
-        <w:t xml:space="preserve">  (cf. </w:t>
+        <w:t xml:space="preserve"> via LinkedIn (cf. </w:t>
       </w:r>
       <w:r>
         <w:rPr>
@@ -1057,17 +920,7 @@
         <w:t>payer Claude le mois prochain</w:t>
       </w:r>
       <w:r>
-        <w:t xml:space="preserve"> : ne mise pas</w:t>
-      </w:r>
-    </w:p>
-    <w:p>
-      <w:r>
-        <w:t xml:space="preserve">  là-dessus sur GetShift seul d'ici demain. Options réalistes : passer sur un</w:t>
-      </w:r>
-    </w:p>
-    <w:p>
-      <w:r>
-        <w:t xml:space="preserve">  </w:t>
+        <w:t xml:space="preserve"> : ne mise pas là-dessus sur GetShift seul d'ici demain. Options réalistes : passer sur un </w:t>
       </w:r>
       <w:r>
         <w:rPr>
@@ -1076,17 +929,7 @@
         <w:t>plan Claude moins cher</w:t>
       </w:r>
       <w:r>
-        <w:t xml:space="preserve"> le temps que ça décolle, ou un petit revenu de service</w:t>
-      </w:r>
-    </w:p>
-    <w:p>
-      <w:r>
-        <w:t xml:space="preserve">  (setup/coaching productivité, dev freelance ponctuel) pour financer l'outil.</w:t>
-      </w:r>
-    </w:p>
-    <w:p>
-      <w:r>
-        <w:t xml:space="preserve">  Ce n'est pas un échec — c'est ce que font 90 % des fondateurs solo au début.</w:t>
+        <w:t xml:space="preserve"> le temps que ça décolle, ou un petit revenu de service (setup/coaching productivité, dev freelance ponctuel) pour financer l'outil. Ce n'est pas un échec — c'est ce que font 90 % des fondateurs solo au début.</w:t>
       </w:r>
     </w:p>
     <w:p>
@@ -1198,17 +1041,7 @@
         <w:t>jours→semaines</w:t>
       </w:r>
       <w:r>
-        <w:t xml:space="preserve"> à crawler et</w:t>
-      </w:r>
-    </w:p>
-    <w:p>
-      <w:r>
-        <w:t xml:space="preserve">   indexer un site neuf. Le sitemap a été soumis le 3 juin — l'indexation n'est pas</w:t>
-      </w:r>
-    </w:p>
-    <w:p>
-      <w:r>
-        <w:t xml:space="preserve">   instantanée.</w:t>
+        <w:t xml:space="preserve"> à crawler et indexer un site neuf. Le sitemap a été soumis le 3 juin — l'indexation n'est pas instantanée.</w:t>
       </w:r>
     </w:p>
     <w:p>
@@ -1222,17 +1055,7 @@
         <w:t>Collision de marque.</w:t>
       </w:r>
       <w:r>
-        <w:t xml:space="preserve"> « GetShift » est déjà utilisé par d'autres (notamment</w:t>
-      </w:r>
-    </w:p>
-    <w:p>
-      <w:r>
-        <w:t xml:space="preserve">   une app de staffing US). Tu es en concurrence sur le mot exact → difficile de</w:t>
-      </w:r>
-    </w:p>
-    <w:p>
-      <w:r>
-        <w:t xml:space="preserve">   sortir 1ᵉʳ sans autorité.</w:t>
+        <w:t xml:space="preserve"> « GetShift » est déjà utilisé par d'autres (notamment une app de staffing US). Tu es en concurrence sur le mot exact → difficile de sortir 1ᵉʳ sans autorité.</w:t>
       </w:r>
     </w:p>
     <w:p>
@@ -1246,12 +1069,7 @@
         <w:t>Peu de backlinks = peu d'autorité.</w:t>
       </w:r>
       <w:r>
-        <w:t xml:space="preserve"> Google n'a aucune raison de te remonter</w:t>
-      </w:r>
-    </w:p>
-    <w:p>
-      <w:r>
-        <w:t xml:space="preserve">   tant que personne ne pointe vers toi.</w:t>
+        <w:t xml:space="preserve"> Google n'a aucune raison de te remonter tant que personne ne pointe vers toi.</w:t>
       </w:r>
     </w:p>
     <w:p>
@@ -1300,12 +1118,7 @@
         <w:t>Backlinks</w:t>
       </w:r>
       <w:r>
-        <w:t xml:space="preserve"> : ton post LinkedIn, Product Hunt, annuaires de startups, ton GitHub,</w:t>
-      </w:r>
-    </w:p>
-    <w:p>
-      <w:r>
-        <w:t xml:space="preserve">  bio Twitter/IG → chaque lien aide.</w:t>
+        <w:t xml:space="preserve"> : ton post LinkedIn, Product Hunt, annuaires de startups, ton GitHub, bio Twitter/IG → chaque lien aide.</w:t>
       </w:r>
     </w:p>
     <w:p>
@@ -1327,10 +1140,8 @@
         </w:rPr>
         <w:t>liens directs</w:t>
       </w:r>
-    </w:p>
-    <w:p>
       <w:r>
-        <w:t xml:space="preserve">  (LinkedIn, bouche-à-oreille), </w:t>
+        <w:t xml:space="preserve"> (LinkedIn, bouche-à-oreille), </w:t>
       </w:r>
       <w:r>
         <w:rPr>
@@ -1339,12 +1150,7 @@
         <w:t>pas</w:t>
       </w:r>
       <w:r>
-        <w:t xml:space="preserve"> par la recherche Google. La recherche, c'est</w:t>
-      </w:r>
-    </w:p>
-    <w:p>
-      <w:r>
-        <w:t xml:space="preserve">  un canal qui paie dans 2–3 mois, pas maintenant. Ne compte pas dessus pour le lancement.</w:t>
+        <w:t xml:space="preserve"> par la recherche Google. La recherche, c'est un canal qui paie dans 2–3 mois, pas maintenant. Ne compte pas dessus pour le lancement.</w:t>
       </w:r>
     </w:p>
     <w:sectPr>

</xml_diff>

<commit_message>
docs: pitch GetShift (valeur abonnement) + italique simple dans le convertisseur
- Nouveau PITCH_GETSHIFT (md/docx/pdf) : quoi répondre sur la plus-value de
  l'abonnement (1 phrase, 3 plus-values, calcul, objections, à dire/ne pas dire).
- _md_to_docx.py : support de l'italique *simple* ; régénération propre des plans.

Co-Authored-By: Claude Opus 4.8 <noreply@anthropic.com>
</commit_message>
<xml_diff>
--- a/docs/GETSHIFT_DIFFERENCIATION_MONETISATION.docx
+++ b/docs/GETSHIFT_DIFFERENCIATION_MONETISATION.docx
@@ -185,7 +185,16 @@
         <w:pStyle w:val="ListBullet"/>
       </w:pPr>
       <w:r>
-        <w:t>Personne ne fait *« dis-moi ton but → voici le plan jour par jour → c'est déjà dans ton agenda »* aussi simplement.</w:t>
+        <w:t xml:space="preserve">Personne ne fait </w:t>
+      </w:r>
+      <w:r>
+        <w:rPr>
+          <w:i/>
+        </w:rPr>
+        <w:t>« dis-moi ton but → voici le plan jour par jour → c'est déjà dans ton agenda »</w:t>
+      </w:r>
+      <w:r>
+        <w:t xml:space="preserve"> aussi simplement.</w:t>
       </w:r>
     </w:p>
     <w:p>
@@ -707,7 +716,25 @@
         <w:t>2ᵉ intégration</w:t>
       </w:r>
       <w:r>
-        <w:t xml:space="preserve"> au moment exact où il en tire de la valeur → il paie pour lever la limite. On ne fait jamais payer pour *commencer*, on fait payer pour *aller plus loin*.</w:t>
+        <w:t xml:space="preserve"> au moment exact où il en tire de la valeur → il paie pour lever la limite. On ne fait jamais payer pour </w:t>
+      </w:r>
+      <w:r>
+        <w:rPr>
+          <w:i/>
+        </w:rPr>
+        <w:t>commencer</w:t>
+      </w:r>
+      <w:r>
+        <w:t xml:space="preserve">, on fait payer pour </w:t>
+      </w:r>
+      <w:r>
+        <w:rPr>
+          <w:i/>
+        </w:rPr>
+        <w:t>aller plus loin</w:t>
+      </w:r>
+      <w:r>
+        <w:t>.</w:t>
       </w:r>
     </w:p>
     <w:p>

</xml_diff>